<commit_message>
fix(rdo): exibir TAGs dos serviços no modelo definitivo
</commit_message>
<xml_diff>
--- a/Modelos/definitivos/Modelo definitivo.docx
+++ b/Modelos/definitivos/Modelo definitivo.docx
@@ -2314,6 +2314,47 @@
                 <w:szCs w:val="18"/>
               </w:rPr>
               <w:t>}}</w:t>
+            </w:r>
+          </w:p>
+        </w:tc>
+      </w:tr>
+      <w:tr>
+        <w:trPr>
+          <w:cantSplit/>
+          <w:trHeight w:val="275"/>
+          <w:tblHeader/>
+          <w:jc w:val="center"/>
+        </w:trPr>
+        <w:tc>
+          <w:tcPr>
+            <w:tcW w:w="10343" w:type="dxa"/>
+            <w:gridSpan w:val="3"/>
+          </w:tcPr>
+          <w:p>
+            <w:pPr>
+              <w:rPr>
+                <w:b/>
+                <w:bCs/>
+                <w:sz w:val="18"/>
+                <w:szCs w:val="18"/>
+              </w:rPr>
+            </w:pPr>
+            <w:r>
+              <w:rPr>
+                <w:b/>
+                <w:bCs/>
+                <w:sz w:val="18"/>
+                <w:szCs w:val="18"/>
+              </w:rPr>
+              <w:t xml:space="preserve">Tags: </w:t>
+            </w:r>
+            <w:r>
+              <w:rPr>
+                <w:color w:val="11437E"/>
+                <w:sz w:val="18"/>
+                <w:szCs w:val="18"/>
+              </w:rPr>
+              <w:t>{{tags}}</w:t>
             </w:r>
           </w:p>
         </w:tc>

</xml_diff>

<commit_message>
feat: mostrar avanço do contrato nos RDOs
</commit_message>
<xml_diff>
--- a/Modelos/definitivos/Modelo definitivo.docx
+++ b/Modelos/definitivos/Modelo definitivo.docx
@@ -1734,6 +1734,7 @@
                 <w:sz w:val="20"/>
                 <w:szCs w:val="20"/>
               </w:rPr>
+              <w:lastRenderedPageBreak/>
               <w:t>Serviço {{</w:t>
             </w:r>
             <w:proofErr w:type="spellStart"/>
@@ -2526,7 +2527,6 @@
                 <w:sz w:val="20"/>
                 <w:szCs w:val="20"/>
               </w:rPr>
-              <w:lastRenderedPageBreak/>
               <w:t>Fotos</w:t>
             </w:r>
           </w:p>
@@ -2601,25 +2601,370 @@
         </w:rPr>
       </w:pPr>
     </w:p>
-    <w:p>
-      <w:pPr>
-        <w:widowControl w:val="0"/>
-        <w:pBdr>
-          <w:top w:val="nil"/>
-          <w:left w:val="nil"/>
-          <w:bottom w:val="nil"/>
-          <w:right w:val="nil"/>
-          <w:between w:val="nil"/>
-        </w:pBdr>
-        <w:rPr>
-          <w:b/>
-          <w:bCs/>
-          <w:color w:val="30503A"/>
-          <w:sz w:val="28"/>
-          <w:szCs w:val="28"/>
-        </w:rPr>
-      </w:pPr>
-    </w:p>
+    <w:tbl>
+      <w:tblPr>
+        <w:tblStyle w:val="Tabelacomgrade"/>
+        <w:tblW w:w="10343" w:type="dxa"/>
+        <w:jc w:val="center"/>
+        <w:tblLook w:val="04A0" w:firstRow="1" w:lastRow="0" w:firstColumn="1" w:lastColumn="0" w:noHBand="0" w:noVBand="1"/>
+      </w:tblPr>
+      <w:tblGrid>
+        <w:gridCol w:w="2585"/>
+        <w:gridCol w:w="2586"/>
+        <w:gridCol w:w="2586"/>
+        <w:gridCol w:w="2586"/>
+      </w:tblGrid>
+      <w:tr>
+        <w:trPr>
+          <w:cantSplit/>
+          <w:trHeight w:val="385"/>
+          <w:tblHeader/>
+          <w:jc w:val="center"/>
+        </w:trPr>
+        <w:tc>
+          <w:tcPr>
+            <w:tcW w:w="10343" w:type="dxa"/>
+            <w:gridSpan w:val="4"/>
+            <w:shd w:val="clear" w:color="auto" w:fill="30503A"/>
+            <w:vAlign w:val="center"/>
+          </w:tcPr>
+          <w:p>
+            <w:pPr>
+              <w:widowControl w:val="0"/>
+              <w:jc w:val="center"/>
+              <w:rPr>
+                <w:b/>
+                <w:bCs/>
+                <w:color w:val="E8E8E8"/>
+                <w:sz w:val="20"/>
+                <w:szCs w:val="20"/>
+              </w:rPr>
+            </w:pPr>
+            <w:r>
+              <w:rPr>
+                <w:b/>
+                <w:bCs/>
+                <w:color w:val="E8E8E8"/>
+                <w:sz w:val="20"/>
+                <w:szCs w:val="20"/>
+              </w:rPr>
+              <w:t>PROGRESSO</w:t>
+            </w:r>
+          </w:p>
+        </w:tc>
+      </w:tr>
+      <w:tr>
+        <w:trPr>
+          <w:trHeight w:val="70"/>
+          <w:jc w:val="center"/>
+        </w:trPr>
+        <w:tc>
+          <w:tcPr>
+            <w:tcW w:w="2585" w:type="dxa"/>
+            <w:shd w:val="clear" w:color="auto" w:fill="E8E8E8"/>
+            <w:vAlign w:val="center"/>
+          </w:tcPr>
+          <w:p>
+            <w:pPr>
+              <w:widowControl w:val="0"/>
+              <w:jc w:val="center"/>
+              <w:rPr>
+                <w:b/>
+                <w:bCs/>
+                <w:color w:val="000000" w:themeColor="text1"/>
+                <w:sz w:val="24"/>
+                <w:szCs w:val="24"/>
+              </w:rPr>
+            </w:pPr>
+            <w:r>
+              <w:rPr>
+                <w:b/>
+                <w:bCs/>
+                <w:color w:val="000000" w:themeColor="text1"/>
+                <w:sz w:val="24"/>
+                <w:szCs w:val="24"/>
+              </w:rPr>
+              <w:t>Dia</w:t>
+            </w:r>
+          </w:p>
+        </w:tc>
+        <w:tc>
+          <w:tcPr>
+            <w:tcW w:w="2586" w:type="dxa"/>
+            <w:shd w:val="clear" w:color="auto" w:fill="E8E8E8"/>
+            <w:vAlign w:val="center"/>
+          </w:tcPr>
+          <w:p>
+            <w:pPr>
+              <w:widowControl w:val="0"/>
+              <w:jc w:val="center"/>
+              <w:rPr>
+                <w:b/>
+                <w:bCs/>
+                <w:color w:val="000000" w:themeColor="text1"/>
+                <w:sz w:val="24"/>
+                <w:szCs w:val="24"/>
+              </w:rPr>
+            </w:pPr>
+            <w:r>
+              <w:rPr>
+                <w:b/>
+                <w:bCs/>
+                <w:color w:val="000000" w:themeColor="text1"/>
+                <w:sz w:val="24"/>
+                <w:szCs w:val="24"/>
+              </w:rPr>
+              <w:t>Serviço</w:t>
+            </w:r>
+          </w:p>
+        </w:tc>
+        <w:tc>
+          <w:tcPr>
+            <w:tcW w:w="2586" w:type="dxa"/>
+            <w:shd w:val="clear" w:color="auto" w:fill="E8E8E8"/>
+            <w:vAlign w:val="center"/>
+          </w:tcPr>
+          <w:p>
+            <w:pPr>
+              <w:widowControl w:val="0"/>
+              <w:jc w:val="center"/>
+              <w:rPr>
+                <w:b/>
+                <w:bCs/>
+                <w:color w:val="000000" w:themeColor="text1"/>
+                <w:sz w:val="24"/>
+                <w:szCs w:val="24"/>
+              </w:rPr>
+            </w:pPr>
+            <w:r>
+              <w:rPr>
+                <w:b/>
+                <w:bCs/>
+                <w:color w:val="000000" w:themeColor="text1"/>
+                <w:sz w:val="24"/>
+                <w:szCs w:val="24"/>
+              </w:rPr>
+              <w:t>Realizado</w:t>
+            </w:r>
+          </w:p>
+        </w:tc>
+        <w:tc>
+          <w:tcPr>
+            <w:tcW w:w="2586" w:type="dxa"/>
+            <w:shd w:val="clear" w:color="auto" w:fill="E8E8E8"/>
+            <w:vAlign w:val="center"/>
+          </w:tcPr>
+          <w:p>
+            <w:pPr>
+              <w:widowControl w:val="0"/>
+              <w:jc w:val="center"/>
+              <w:rPr>
+                <w:b/>
+                <w:bCs/>
+                <w:color w:val="000000" w:themeColor="text1"/>
+                <w:sz w:val="24"/>
+                <w:szCs w:val="24"/>
+              </w:rPr>
+            </w:pPr>
+            <w:r>
+              <w:rPr>
+                <w:b/>
+                <w:bCs/>
+                <w:color w:val="000000" w:themeColor="text1"/>
+                <w:sz w:val="24"/>
+                <w:szCs w:val="24"/>
+              </w:rPr>
+              <w:t>Acumulado</w:t>
+            </w:r>
+          </w:p>
+        </w:tc>
+      </w:tr>
+      <w:tr>
+        <w:trPr>
+          <w:trHeight w:val="371"/>
+          <w:jc w:val="center"/>
+        </w:trPr>
+        <w:tc>
+          <w:tcPr>
+            <w:tcW w:w="2585" w:type="dxa"/>
+            <w:vAlign w:val="center"/>
+          </w:tcPr>
+          <w:p>
+            <w:pPr>
+              <w:widowControl w:val="0"/>
+              <w:jc w:val="center"/>
+              <w:rPr>
+                <w:b/>
+                <w:bCs/>
+                <w:color w:val="30503A"/>
+                <w:sz w:val="28"/>
+                <w:szCs w:val="28"/>
+              </w:rPr>
+            </w:pPr>
+            <w:r>
+              <w:rPr>
+                <w:color w:val="11437E"/>
+                <w:sz w:val="18"/>
+                <w:szCs w:val="18"/>
+              </w:rPr>
+              <w:t>{{</w:t>
+            </w:r>
+            <w:proofErr w:type="spellStart"/>
+            <w:r>
+              <w:rPr>
+                <w:color w:val="11437E"/>
+                <w:sz w:val="18"/>
+                <w:szCs w:val="18"/>
+              </w:rPr>
+              <w:t>progressday</w:t>
+            </w:r>
+            <w:proofErr w:type="spellEnd"/>
+            <w:r>
+              <w:rPr>
+                <w:color w:val="11437E"/>
+                <w:sz w:val="18"/>
+                <w:szCs w:val="18"/>
+              </w:rPr>
+              <w:t>}}</w:t>
+            </w:r>
+          </w:p>
+        </w:tc>
+        <w:tc>
+          <w:tcPr>
+            <w:tcW w:w="2586" w:type="dxa"/>
+            <w:vAlign w:val="center"/>
+          </w:tcPr>
+          <w:p>
+            <w:pPr>
+              <w:widowControl w:val="0"/>
+              <w:rPr>
+                <w:b/>
+                <w:bCs/>
+                <w:color w:val="30503A"/>
+                <w:sz w:val="28"/>
+                <w:szCs w:val="28"/>
+              </w:rPr>
+            </w:pPr>
+            <w:r>
+              <w:rPr>
+                <w:color w:val="11437E"/>
+                <w:sz w:val="18"/>
+                <w:szCs w:val="18"/>
+              </w:rPr>
+              <w:t>{{</w:t>
+            </w:r>
+            <w:proofErr w:type="spellStart"/>
+            <w:r>
+              <w:rPr>
+                <w:color w:val="11437E"/>
+                <w:sz w:val="18"/>
+                <w:szCs w:val="18"/>
+              </w:rPr>
+              <w:t>progressservicetype</w:t>
+            </w:r>
+            <w:proofErr w:type="spellEnd"/>
+            <w:r>
+              <w:rPr>
+                <w:color w:val="11437E"/>
+                <w:sz w:val="18"/>
+                <w:szCs w:val="18"/>
+              </w:rPr>
+              <w:t>}}</w:t>
+            </w:r>
+          </w:p>
+        </w:tc>
+        <w:tc>
+          <w:tcPr>
+            <w:tcW w:w="2586" w:type="dxa"/>
+            <w:vAlign w:val="center"/>
+          </w:tcPr>
+          <w:p>
+            <w:pPr>
+              <w:widowControl w:val="0"/>
+              <w:jc w:val="center"/>
+              <w:rPr>
+                <w:b/>
+                <w:bCs/>
+                <w:color w:val="30503A"/>
+                <w:sz w:val="28"/>
+                <w:szCs w:val="28"/>
+              </w:rPr>
+            </w:pPr>
+            <w:r>
+              <w:rPr>
+                <w:color w:val="11437E"/>
+                <w:sz w:val="18"/>
+                <w:szCs w:val="18"/>
+              </w:rPr>
+              <w:t>{{</w:t>
+            </w:r>
+            <w:proofErr w:type="spellStart"/>
+            <w:r>
+              <w:rPr>
+                <w:color w:val="11437E"/>
+                <w:sz w:val="18"/>
+                <w:szCs w:val="18"/>
+              </w:rPr>
+              <w:t>progressmade</w:t>
+            </w:r>
+            <w:proofErr w:type="spellEnd"/>
+            <w:r>
+              <w:rPr>
+                <w:color w:val="11437E"/>
+                <w:sz w:val="18"/>
+                <w:szCs w:val="18"/>
+              </w:rPr>
+              <w:t>}}</w:t>
+            </w:r>
+          </w:p>
+        </w:tc>
+        <w:tc>
+          <w:tcPr>
+            <w:tcW w:w="2586" w:type="dxa"/>
+            <w:vAlign w:val="center"/>
+          </w:tcPr>
+          <w:p>
+            <w:pPr>
+              <w:widowControl w:val="0"/>
+              <w:jc w:val="right"/>
+              <w:rPr>
+                <w:b/>
+                <w:bCs/>
+                <w:color w:val="30503A"/>
+                <w:sz w:val="28"/>
+                <w:szCs w:val="28"/>
+              </w:rPr>
+            </w:pPr>
+            <w:r>
+              <w:rPr>
+                <w:color w:val="11437E"/>
+                <w:sz w:val="18"/>
+                <w:szCs w:val="18"/>
+              </w:rPr>
+              <w:t>{{</w:t>
+            </w:r>
+            <w:proofErr w:type="spellStart"/>
+            <w:r>
+              <w:rPr>
+                <w:color w:val="11437E"/>
+                <w:sz w:val="18"/>
+                <w:szCs w:val="18"/>
+              </w:rPr>
+              <w:t>totalprogress</w:t>
+            </w:r>
+            <w:proofErr w:type="spellEnd"/>
+            <w:r>
+              <w:rPr>
+                <w:color w:val="11437E"/>
+                <w:sz w:val="18"/>
+                <w:szCs w:val="18"/>
+              </w:rPr>
+              <w:t>}}</w:t>
+            </w:r>
+          </w:p>
+        </w:tc>
+      </w:tr>
+    </w:tbl>
     <w:tbl>
       <w:tblPr>
         <w:tblStyle w:val="a4"/>
@@ -4189,7 +4534,7 @@
   <w:style w:type="paragraph" w:default="1" w:styleId="Normal">
     <w:name w:val="Normal"/>
     <w:qFormat/>
-    <w:rsid w:val="003D6684"/>
+    <w:rsid w:val="00511EB0"/>
   </w:style>
   <w:style w:type="paragraph" w:styleId="Ttulo1">
     <w:name w:val="heading 1"/>

</xml_diff>